<commit_message>
Add balanced image classification experiment
</commit_message>
<xml_diff>
--- a/Cervical cancer detection system.docx
+++ b/Cervical cancer detection system.docx
@@ -1936,6 +1936,154 @@
         <w:t xml:space="preserve"> Model has high abnormal recall but produces false positives on some normal images.</w:t>
       </w:r>
     </w:p>
+    <w:p>
+      <w:pPr>
+        <w:pStyle w:val="Heading3"/>
+      </w:pPr>
+      <w:r>
+        <w:t>Compare with original</w:t>
+      </w:r>
+    </w:p>
+    <w:tbl>
+      <w:tblPr>
+        <w:tblW w:w="0" w:type="auto"/>
+        <w:tblCellSpacing w:w="15" w:type="dxa"/>
+        <w:tblCellMar>
+          <w:top w:w="15" w:type="dxa"/>
+          <w:left w:w="15" w:type="dxa"/>
+          <w:bottom w:w="15" w:type="dxa"/>
+          <w:right w:w="15" w:type="dxa"/>
+        </w:tblCellMar>
+        <w:tblLook w:val="04A0" w:firstRow="1" w:lastRow="0" w:firstColumn="1" w:lastColumn="0" w:noHBand="0" w:noVBand="1"/>
+      </w:tblPr>
+      <w:tblGrid>
+        <w:gridCol w:w="1803"/>
+        <w:gridCol w:w="2332"/>
+      </w:tblGrid>
+      <w:tr>
+        <w:trPr>
+          <w:tblHeader/>
+          <w:tblCellSpacing w:w="15" w:type="dxa"/>
+        </w:trPr>
+        <w:tc>
+          <w:tcPr>
+            <w:tcW w:w="0" w:type="auto"/>
+            <w:vAlign w:val="center"/>
+            <w:hideMark/>
+          </w:tcPr>
+          <w:p>
+            <w:pPr>
+              <w:jc w:val="center"/>
+              <w:rPr>
+                <w:b/>
+                <w:bCs/>
+              </w:rPr>
+            </w:pPr>
+            <w:r>
+              <w:rPr>
+                <w:b/>
+                <w:bCs/>
+              </w:rPr>
+              <w:t>Model</w:t>
+            </w:r>
+          </w:p>
+        </w:tc>
+        <w:tc>
+          <w:tcPr>
+            <w:tcW w:w="0" w:type="auto"/>
+            <w:vAlign w:val="center"/>
+            <w:hideMark/>
+          </w:tcPr>
+          <w:p>
+            <w:pPr>
+              <w:jc w:val="center"/>
+              <w:rPr>
+                <w:b/>
+                <w:bCs/>
+              </w:rPr>
+            </w:pPr>
+            <w:r>
+              <w:rPr>
+                <w:b/>
+                <w:bCs/>
+              </w:rPr>
+              <w:t>Best Validation Accuracy</w:t>
+            </w:r>
+          </w:p>
+        </w:tc>
+      </w:tr>
+      <w:tr>
+        <w:trPr>
+          <w:tblCellSpacing w:w="15" w:type="dxa"/>
+        </w:trPr>
+        <w:tc>
+          <w:tcPr>
+            <w:tcW w:w="0" w:type="auto"/>
+            <w:vAlign w:val="center"/>
+            <w:hideMark/>
+          </w:tcPr>
+          <w:p>
+            <w:r>
+              <w:t>Original ResNet18</w:t>
+            </w:r>
+          </w:p>
+        </w:tc>
+        <w:tc>
+          <w:tcPr>
+            <w:tcW w:w="0" w:type="auto"/>
+            <w:vAlign w:val="center"/>
+            <w:hideMark/>
+          </w:tcPr>
+          <w:p>
+            <w:r>
+              <w:t>92.75%</w:t>
+            </w:r>
+          </w:p>
+        </w:tc>
+      </w:tr>
+      <w:tr>
+        <w:trPr>
+          <w:tblCellSpacing w:w="15" w:type="dxa"/>
+        </w:trPr>
+        <w:tc>
+          <w:tcPr>
+            <w:tcW w:w="0" w:type="auto"/>
+            <w:vAlign w:val="center"/>
+            <w:hideMark/>
+          </w:tcPr>
+          <w:p>
+            <w:r>
+              <w:t>Balanced ResNet18</w:t>
+            </w:r>
+          </w:p>
+        </w:tc>
+        <w:tc>
+          <w:tcPr>
+            <w:tcW w:w="0" w:type="auto"/>
+            <w:vAlign w:val="center"/>
+            <w:hideMark/>
+          </w:tcPr>
+          <w:p>
+            <w:r>
+              <w:rPr>
+                <w:rStyle w:val="Strong"/>
+              </w:rPr>
+              <w:t>94.20%</w:t>
+            </w:r>
+            <w:r>
+              <w:t xml:space="preserve"> </w:t>
+            </w:r>
+            <w:r>
+              <w:rPr>
+                <w:rFonts w:ascii="Segoe UI Emoji" w:hAnsi="Segoe UI Emoji" w:cs="Segoe UI Emoji"/>
+              </w:rPr>
+              <w:t>✅</w:t>
+            </w:r>
+          </w:p>
+        </w:tc>
+      </w:tr>
+    </w:tbl>
+    <w:p/>
     <w:sectPr>
       <w:pgSz w:w="11906" w:h="16838"/>
       <w:pgMar w:top="1440" w:right="1440" w:bottom="1440" w:left="1440" w:header="708" w:footer="708" w:gutter="0"/>

</xml_diff>

<commit_message>
Add TensorFlow cervical cell detection system
</commit_message>
<xml_diff>
--- a/Cervical cancer detection system.docx
+++ b/Cervical cancer detection system.docx
@@ -83,27 +83,7 @@
           <w:szCs w:val="24"/>
           <w:lang w:eastAsia="en-IN"/>
         </w:rPr>
-        <w:t xml:space="preserve">To develop an AI/ML-based system that </w:t>
-      </w:r>
-      <w:proofErr w:type="spellStart"/>
-      <w:r>
-        <w:rPr>
-          <w:rFonts w:ascii="Times New Roman" w:eastAsia="Times New Roman" w:hAnsi="Times New Roman" w:cs="Times New Roman"/>
-          <w:sz w:val="24"/>
-          <w:szCs w:val="24"/>
-          <w:lang w:eastAsia="en-IN"/>
-        </w:rPr>
-        <w:t>analyzes</w:t>
-      </w:r>
-      <w:proofErr w:type="spellEnd"/>
-      <w:r>
-        <w:rPr>
-          <w:rFonts w:ascii="Times New Roman" w:eastAsia="Times New Roman" w:hAnsi="Times New Roman" w:cs="Times New Roman"/>
-          <w:sz w:val="24"/>
-          <w:szCs w:val="24"/>
-          <w:lang w:eastAsia="en-IN"/>
-        </w:rPr>
-        <w:t xml:space="preserve"> cervical cell images and classifies them into:</w:t>
+        <w:t>To develop an AI/ML-based system that analyzes cervical cell images and classifies them into:</w:t>
       </w:r>
     </w:p>
     <w:p>
@@ -950,21 +930,8 @@
           <w:szCs w:val="27"/>
           <w:lang w:eastAsia="en-IN"/>
         </w:rPr>
-        <w:t xml:space="preserve">4. </w:t>
-      </w:r>
-      <w:proofErr w:type="spellStart"/>
-      <w:r>
-        <w:rPr>
-          <w:rFonts w:ascii="Times New Roman" w:eastAsia="Times New Roman" w:hAnsi="Times New Roman" w:cs="Times New Roman"/>
-          <w:b/>
-          <w:bCs/>
-          <w:sz w:val="27"/>
-          <w:szCs w:val="27"/>
-          <w:lang w:eastAsia="en-IN"/>
-        </w:rPr>
-        <w:t>Preprocessing</w:t>
-      </w:r>
-      <w:proofErr w:type="spellEnd"/>
+        <w:t>4. Preprocessing</w:t>
+      </w:r>
     </w:p>
     <w:p>
       <w:pPr>
@@ -1145,21 +1112,8 @@
           <w:lang w:eastAsia="en-IN"/>
         </w:rPr>
         <w:lastRenderedPageBreak/>
-        <w:t xml:space="preserve">5. </w:t>
-      </w:r>
-      <w:proofErr w:type="spellStart"/>
-      <w:r>
-        <w:rPr>
-          <w:rFonts w:ascii="Times New Roman" w:eastAsia="Times New Roman" w:hAnsi="Times New Roman" w:cs="Times New Roman"/>
-          <w:b/>
-          <w:bCs/>
-          <w:sz w:val="27"/>
-          <w:szCs w:val="27"/>
-          <w:lang w:eastAsia="en-IN"/>
-        </w:rPr>
-        <w:t>PyTorch</w:t>
-      </w:r>
-      <w:proofErr w:type="spellEnd"/>
+        <w:t>5. PyTorch</w:t>
+      </w:r>
     </w:p>
     <w:p>
       <w:pPr>
@@ -1195,25 +1149,14 @@
           <w:lang w:eastAsia="en-IN"/>
         </w:rPr>
       </w:pPr>
-      <w:proofErr w:type="spellStart"/>
-      <w:r>
-        <w:rPr>
-          <w:rFonts w:ascii="Times New Roman" w:eastAsia="Times New Roman" w:hAnsi="Times New Roman" w:cs="Times New Roman"/>
-          <w:sz w:val="24"/>
-          <w:szCs w:val="24"/>
-          <w:lang w:eastAsia="en-IN"/>
-        </w:rPr>
-        <w:t>PyTorch</w:t>
-      </w:r>
-      <w:proofErr w:type="spellEnd"/>
-      <w:r>
-        <w:rPr>
-          <w:rFonts w:ascii="Times New Roman" w:eastAsia="Times New Roman" w:hAnsi="Times New Roman" w:cs="Times New Roman"/>
-          <w:sz w:val="24"/>
-          <w:szCs w:val="24"/>
-          <w:lang w:eastAsia="en-IN"/>
-        </w:rPr>
-        <w:t xml:space="preserve"> </w:t>
+      <w:r>
+        <w:rPr>
+          <w:rFonts w:ascii="Times New Roman" w:eastAsia="Times New Roman" w:hAnsi="Times New Roman" w:cs="Times New Roman"/>
+          <w:sz w:val="24"/>
+          <w:szCs w:val="24"/>
+          <w:lang w:eastAsia="en-IN"/>
+        </w:rPr>
+        <w:t xml:space="preserve">PyTorch </w:t>
       </w:r>
       <w:r>
         <w:rPr>
@@ -1248,25 +1191,14 @@
           <w:lang w:eastAsia="en-IN"/>
         </w:rPr>
       </w:pPr>
-      <w:proofErr w:type="spellStart"/>
-      <w:r>
-        <w:rPr>
-          <w:rFonts w:ascii="Times New Roman" w:eastAsia="Times New Roman" w:hAnsi="Times New Roman" w:cs="Times New Roman"/>
-          <w:sz w:val="24"/>
-          <w:szCs w:val="24"/>
-          <w:lang w:eastAsia="en-IN"/>
-        </w:rPr>
-        <w:t>Torchvision</w:t>
-      </w:r>
-      <w:proofErr w:type="spellEnd"/>
-      <w:r>
-        <w:rPr>
-          <w:rFonts w:ascii="Times New Roman" w:eastAsia="Times New Roman" w:hAnsi="Times New Roman" w:cs="Times New Roman"/>
-          <w:sz w:val="24"/>
-          <w:szCs w:val="24"/>
-          <w:lang w:eastAsia="en-IN"/>
-        </w:rPr>
-        <w:t xml:space="preserve"> </w:t>
+      <w:r>
+        <w:rPr>
+          <w:rFonts w:ascii="Times New Roman" w:eastAsia="Times New Roman" w:hAnsi="Times New Roman" w:cs="Times New Roman"/>
+          <w:sz w:val="24"/>
+          <w:szCs w:val="24"/>
+          <w:lang w:eastAsia="en-IN"/>
+        </w:rPr>
+        <w:t xml:space="preserve">Torchvision </w:t>
       </w:r>
       <w:r>
         <w:rPr>
@@ -1381,25 +1313,14 @@
           <w:lang w:eastAsia="en-IN"/>
         </w:rPr>
       </w:pPr>
-      <w:proofErr w:type="spellStart"/>
-      <w:r>
-        <w:rPr>
-          <w:rFonts w:ascii="Times New Roman" w:eastAsia="Times New Roman" w:hAnsi="Times New Roman" w:cs="Times New Roman"/>
-          <w:sz w:val="24"/>
-          <w:szCs w:val="24"/>
-          <w:lang w:eastAsia="en-IN"/>
-        </w:rPr>
-        <w:t>DataLoader</w:t>
-      </w:r>
-      <w:proofErr w:type="spellEnd"/>
-      <w:r>
-        <w:rPr>
-          <w:rFonts w:ascii="Times New Roman" w:eastAsia="Times New Roman" w:hAnsi="Times New Roman" w:cs="Times New Roman"/>
-          <w:sz w:val="24"/>
-          <w:szCs w:val="24"/>
-          <w:lang w:eastAsia="en-IN"/>
-        </w:rPr>
-        <w:t xml:space="preserve"> tested successfully:</w:t>
+      <w:r>
+        <w:rPr>
+          <w:rFonts w:ascii="Times New Roman" w:eastAsia="Times New Roman" w:hAnsi="Times New Roman" w:cs="Times New Roman"/>
+          <w:sz w:val="24"/>
+          <w:szCs w:val="24"/>
+          <w:lang w:eastAsia="en-IN"/>
+        </w:rPr>
+        <w:t>DataLoader tested successfully:</w:t>
       </w:r>
     </w:p>
     <w:p>
@@ -1629,25 +1550,14 @@
           <w:lang w:eastAsia="en-IN"/>
         </w:rPr>
       </w:pPr>
-      <w:proofErr w:type="gramStart"/>
-      <w:r>
-        <w:rPr>
-          <w:rFonts w:ascii="Times New Roman" w:eastAsia="Times New Roman" w:hAnsi="Times New Roman" w:cs="Times New Roman"/>
-          <w:sz w:val="24"/>
-          <w:szCs w:val="24"/>
-          <w:lang w:eastAsia="en-IN"/>
-        </w:rPr>
-        <w:t>So</w:t>
-      </w:r>
-      <w:proofErr w:type="gramEnd"/>
-      <w:r>
-        <w:rPr>
-          <w:rFonts w:ascii="Times New Roman" w:eastAsia="Times New Roman" w:hAnsi="Times New Roman" w:cs="Times New Roman"/>
-          <w:sz w:val="24"/>
-          <w:szCs w:val="24"/>
-          <w:lang w:eastAsia="en-IN"/>
-        </w:rPr>
-        <w:t xml:space="preserve"> we should not depend only on accuracy.</w:t>
+      <w:r>
+        <w:rPr>
+          <w:rFonts w:ascii="Times New Roman" w:eastAsia="Times New Roman" w:hAnsi="Times New Roman" w:cs="Times New Roman"/>
+          <w:sz w:val="24"/>
+          <w:szCs w:val="24"/>
+          <w:lang w:eastAsia="en-IN"/>
+        </w:rPr>
+        <w:t>So we should not depend only on accuracy.</w:t>
       </w:r>
     </w:p>
     <w:p/>
@@ -1836,6 +1746,9 @@
       </w:r>
       <w:r>
         <w:t xml:space="preserve"> 92%</w:t>
+      </w:r>
+      <w:r>
+        <w:t>z</w:t>
       </w:r>
       <w:r>
         <w:br/>
@@ -2083,7 +1996,49 @@
         </w:tc>
       </w:tr>
     </w:tbl>
-    <w:p/>
+    <w:p>
+      <w:r>
+        <w:rPr>
+          <w:noProof/>
+        </w:rPr>
+        <w:lastRenderedPageBreak/>
+        <w:drawing>
+          <wp:inline distT="0" distB="0" distL="0" distR="0" wp14:anchorId="080E00C6" wp14:editId="2E2F7913">
+            <wp:extent cx="5731510" cy="5063490"/>
+            <wp:effectExtent l="0" t="0" r="2540" b="3810"/>
+            <wp:docPr id="2" name="Picture 2"/>
+            <wp:cNvGraphicFramePr>
+              <a:graphicFrameLocks xmlns:a="http://schemas.openxmlformats.org/drawingml/2006/main" noChangeAspect="1"/>
+            </wp:cNvGraphicFramePr>
+            <a:graphic xmlns:a="http://schemas.openxmlformats.org/drawingml/2006/main">
+              <a:graphicData uri="http://schemas.openxmlformats.org/drawingml/2006/picture">
+                <pic:pic xmlns:pic="http://schemas.openxmlformats.org/drawingml/2006/picture">
+                  <pic:nvPicPr>
+                    <pic:cNvPr id="1" name=""/>
+                    <pic:cNvPicPr/>
+                  </pic:nvPicPr>
+                  <pic:blipFill>
+                    <a:blip r:embed="rId6"/>
+                    <a:stretch>
+                      <a:fillRect/>
+                    </a:stretch>
+                  </pic:blipFill>
+                  <pic:spPr>
+                    <a:xfrm>
+                      <a:off x="0" y="0"/>
+                      <a:ext cx="5731510" cy="5063490"/>
+                    </a:xfrm>
+                    <a:prstGeom prst="rect">
+                      <a:avLst/>
+                    </a:prstGeom>
+                  </pic:spPr>
+                </pic:pic>
+              </a:graphicData>
+            </a:graphic>
+          </wp:inline>
+        </w:drawing>
+      </w:r>
+    </w:p>
     <w:sectPr>
       <w:pgSz w:w="11906" w:h="16838"/>
       <w:pgMar w:top="1440" w:right="1440" w:bottom="1440" w:left="1440" w:header="708" w:footer="708" w:gutter="0"/>

</xml_diff>